<commit_message>
Add region selection rationale to report
</commit_message>
<xml_diff>
--- a/report/recovery-report.docx
+++ b/report/recovery-report.docx
@@ -344,6 +344,50 @@
       </w:r>
       <w:r>
         <w:t xml:space="preserve">preserved, what changes, and why each enhancement supports recovery.]</w:t>
+      </w:r>
+    </w:p>
+    <w:p>
+      <w:pPr>
+        <w:pStyle w:val="BodyText"/>
+      </w:pPr>
+      <w:r>
+        <w:t xml:space="preserve">The primary remains in us-east-1 to preserve the instructor baseline and its</w:t>
+      </w:r>
+      <w:r>
+        <w:t xml:space="preserve"> </w:t>
+      </w:r>
+      <w:r>
+        <w:t xml:space="preserve">original N. Virginia workflow. The DR design uses a separate Region and VPC to</w:t>
+      </w:r>
+      <w:r>
+        <w:t xml:space="preserve"> </w:t>
+      </w:r>
+      <w:r>
+        <w:t xml:space="preserve">avoid a single-Region failure domain. The student account denied the required</w:t>
+      </w:r>
+      <w:r>
+        <w:t xml:space="preserve"> </w:t>
+      </w:r>
+      <w:r>
+        <w:t xml:space="preserve">us-west-2 creates, so the same module was tested in us-east-2; this preserves</w:t>
+      </w:r>
+      <w:r>
+        <w:t xml:space="preserve"> </w:t>
+      </w:r>
+      <w:r>
+        <w:t xml:space="preserve">regional separation while documenting an account-policy constraint. The DR task</w:t>
+      </w:r>
+      <w:r>
+        <w:t xml:space="preserve"> </w:t>
+      </w:r>
+      <w:r>
+        <w:t xml:space="preserve">count is reduced to one to lower standby cost, while the primary uses two tasks</w:t>
+      </w:r>
+      <w:r>
+        <w:t xml:space="preserve"> </w:t>
+      </w:r>
+      <w:r>
+        <w:t xml:space="preserve">across two Availability Zones.</w:t>
       </w:r>
     </w:p>
     <w:p>

</xml_diff>